<commit_message>
Regenerate report with all screenshots and real repo link
</commit_message>
<xml_diff>
--- a/Assignment01_Report.docx
+++ b/Assignment01_Report.docx
@@ -172,7 +172,7 @@
         <w:rPr>
           <w:sz w:val="22"/>
         </w:rPr>
-        <w:t>https://github.com/&lt;your-username&gt;/heart-disease-mlops</w:t>
+        <w:t>https://github.com/yogisamy/MLOps-Assignment1</w:t>
       </w:r>
     </w:p>
     <w:p>
@@ -3003,7 +3003,7 @@
               <a:graphicData uri="http://schemas.openxmlformats.org/drawingml/2006/picture">
                 <pic:pic>
                   <pic:nvPicPr>
-                    <pic:cNvPr id="0" name="mlflow_run_detail.png"/>
+                    <pic:cNvPr id="0" name="mlflow_experiments_detail.png"/>
                     <pic:cNvPicPr/>
                   </pic:nvPicPr>
                   <pic:blipFill>
@@ -3035,7 +3035,58 @@
           <w:i/>
           <w:sz w:val="18"/>
         </w:rPr>
-        <w:t>Figure 8: MLflow Run Detail — Parameters, Metrics and Artifacts</w:t>
+        <w:t>Figure 8: MLflow Experiment — Run Comparison View</w:t>
+      </w:r>
+    </w:p>
+    <w:p>
+      <w:pPr>
+        <w:jc w:val="center"/>
+      </w:pPr>
+      <w:r>
+        <w:drawing>
+          <wp:inline xmlns:a="http://schemas.openxmlformats.org/drawingml/2006/main" xmlns:pic="http://schemas.openxmlformats.org/drawingml/2006/picture">
+            <wp:extent cx="5029200" cy="3143250"/>
+            <wp:docPr id="9" name="Picture 9"/>
+            <wp:cNvGraphicFramePr>
+              <a:graphicFrameLocks noChangeAspect="1"/>
+            </wp:cNvGraphicFramePr>
+            <a:graphic>
+              <a:graphicData uri="http://schemas.openxmlformats.org/drawingml/2006/picture">
+                <pic:pic>
+                  <pic:nvPicPr>
+                    <pic:cNvPr id="0" name="mlflow_run_detail.png"/>
+                    <pic:cNvPicPr/>
+                  </pic:nvPicPr>
+                  <pic:blipFill>
+                    <a:blip r:embed="rId17"/>
+                    <a:stretch>
+                      <a:fillRect/>
+                    </a:stretch>
+                  </pic:blipFill>
+                  <pic:spPr>
+                    <a:xfrm>
+                      <a:off x="0" y="0"/>
+                      <a:ext cx="5029200" cy="3143250"/>
+                    </a:xfrm>
+                    <a:prstGeom prst="rect"/>
+                  </pic:spPr>
+                </pic:pic>
+              </a:graphicData>
+            </a:graphic>
+          </wp:inline>
+        </w:drawing>
+      </w:r>
+    </w:p>
+    <w:p>
+      <w:pPr>
+        <w:jc w:val="center"/>
+      </w:pPr>
+      <w:r>
+        <w:rPr>
+          <w:i/>
+          <w:sz w:val="18"/>
+        </w:rPr>
+        <w:t>Figure 9: MLflow Run Detail — Parameters, Metrics and Artifacts</w:t>
       </w:r>
     </w:p>
     <w:p>
@@ -4693,7 +4744,7 @@
           <w:i/>
           <w:color w:val="888888"/>
         </w:rPr>
-        <w:t>[Screenshot placeholder: Figure 9: GitHub Actions — Successful CI Run]</w:t>
+        <w:t>[Screenshot placeholder: Figure 10: GitHub Actions — Successful CI Run]</w:t>
       </w:r>
     </w:p>
     <w:p>
@@ -4705,7 +4756,7 @@
           <w:i/>
           <w:color w:val="888888"/>
         </w:rPr>
-        <w:t>[Screenshot placeholder: Figure 10: GitHub Actions — Step Detail with Logs]</w:t>
+        <w:t>[Screenshot placeholder: Figure 11: GitHub Actions — Step Detail with Logs]</w:t>
       </w:r>
     </w:p>
     <w:p>
@@ -5357,7 +5408,7 @@
         <w:drawing>
           <wp:inline xmlns:a="http://schemas.openxmlformats.org/drawingml/2006/main" xmlns:pic="http://schemas.openxmlformats.org/drawingml/2006/picture">
             <wp:extent cx="5029200" cy="3143250"/>
-            <wp:docPr id="9" name="Picture 9"/>
+            <wp:docPr id="10" name="Picture 10"/>
             <wp:cNvGraphicFramePr>
               <a:graphicFrameLocks noChangeAspect="1"/>
             </wp:cNvGraphicFramePr>
@@ -5366,57 +5417,6 @@
                 <pic:pic>
                   <pic:nvPicPr>
                     <pic:cNvPr id="0" name="docker_build.png"/>
-                    <pic:cNvPicPr/>
-                  </pic:nvPicPr>
-                  <pic:blipFill>
-                    <a:blip r:embed="rId17"/>
-                    <a:stretch>
-                      <a:fillRect/>
-                    </a:stretch>
-                  </pic:blipFill>
-                  <pic:spPr>
-                    <a:xfrm>
-                      <a:off x="0" y="0"/>
-                      <a:ext cx="5029200" cy="3143250"/>
-                    </a:xfrm>
-                    <a:prstGeom prst="rect"/>
-                  </pic:spPr>
-                </pic:pic>
-              </a:graphicData>
-            </a:graphic>
-          </wp:inline>
-        </w:drawing>
-      </w:r>
-    </w:p>
-    <w:p>
-      <w:pPr>
-        <w:jc w:val="center"/>
-      </w:pPr>
-      <w:r>
-        <w:rPr>
-          <w:i/>
-          <w:sz w:val="18"/>
-        </w:rPr>
-        <w:t>Figure 11: Docker Image Build Output</w:t>
-      </w:r>
-    </w:p>
-    <w:p>
-      <w:pPr>
-        <w:jc w:val="center"/>
-      </w:pPr>
-      <w:r>
-        <w:drawing>
-          <wp:inline xmlns:a="http://schemas.openxmlformats.org/drawingml/2006/main" xmlns:pic="http://schemas.openxmlformats.org/drawingml/2006/picture">
-            <wp:extent cx="5029200" cy="3143250"/>
-            <wp:docPr id="10" name="Picture 10"/>
-            <wp:cNvGraphicFramePr>
-              <a:graphicFrameLocks noChangeAspect="1"/>
-            </wp:cNvGraphicFramePr>
-            <a:graphic>
-              <a:graphicData uri="http://schemas.openxmlformats.org/drawingml/2006/picture">
-                <pic:pic>
-                  <pic:nvPicPr>
-                    <pic:cNvPr id="0" name="docker_predict.png"/>
                     <pic:cNvPicPr/>
                   </pic:nvPicPr>
                   <pic:blipFill>
@@ -5448,7 +5448,109 @@
           <w:i/>
           <w:sz w:val="18"/>
         </w:rPr>
-        <w:t>Figure 12: Docker Container — /predict Endpoint Response</w:t>
+        <w:t>Figure 12: Docker Image Build Output</w:t>
+      </w:r>
+    </w:p>
+    <w:p>
+      <w:pPr>
+        <w:jc w:val="center"/>
+      </w:pPr>
+      <w:r>
+        <w:drawing>
+          <wp:inline xmlns:a="http://schemas.openxmlformats.org/drawingml/2006/main" xmlns:pic="http://schemas.openxmlformats.org/drawingml/2006/picture">
+            <wp:extent cx="5029200" cy="3143250"/>
+            <wp:docPr id="11" name="Picture 11"/>
+            <wp:cNvGraphicFramePr>
+              <a:graphicFrameLocks noChangeAspect="1"/>
+            </wp:cNvGraphicFramePr>
+            <a:graphic>
+              <a:graphicData uri="http://schemas.openxmlformats.org/drawingml/2006/picture">
+                <pic:pic>
+                  <pic:nvPicPr>
+                    <pic:cNvPr id="0" name="docker_predict.png"/>
+                    <pic:cNvPicPr/>
+                  </pic:nvPicPr>
+                  <pic:blipFill>
+                    <a:blip r:embed="rId19"/>
+                    <a:stretch>
+                      <a:fillRect/>
+                    </a:stretch>
+                  </pic:blipFill>
+                  <pic:spPr>
+                    <a:xfrm>
+                      <a:off x="0" y="0"/>
+                      <a:ext cx="5029200" cy="3143250"/>
+                    </a:xfrm>
+                    <a:prstGeom prst="rect"/>
+                  </pic:spPr>
+                </pic:pic>
+              </a:graphicData>
+            </a:graphic>
+          </wp:inline>
+        </w:drawing>
+      </w:r>
+    </w:p>
+    <w:p>
+      <w:pPr>
+        <w:jc w:val="center"/>
+      </w:pPr>
+      <w:r>
+        <w:rPr>
+          <w:i/>
+          <w:sz w:val="18"/>
+        </w:rPr>
+        <w:t>Figure 13: Docker Container — /predict Endpoint Response</w:t>
+      </w:r>
+    </w:p>
+    <w:p>
+      <w:pPr>
+        <w:jc w:val="center"/>
+      </w:pPr>
+      <w:r>
+        <w:drawing>
+          <wp:inline xmlns:a="http://schemas.openxmlformats.org/drawingml/2006/main" xmlns:pic="http://schemas.openxmlformats.org/drawingml/2006/picture">
+            <wp:extent cx="5029200" cy="3143250"/>
+            <wp:docPr id="12" name="Picture 12"/>
+            <wp:cNvGraphicFramePr>
+              <a:graphicFrameLocks noChangeAspect="1"/>
+            </wp:cNvGraphicFramePr>
+            <a:graphic>
+              <a:graphicData uri="http://schemas.openxmlformats.org/drawingml/2006/picture">
+                <pic:pic>
+                  <pic:nvPicPr>
+                    <pic:cNvPr id="0" name="api_health.png"/>
+                    <pic:cNvPicPr/>
+                  </pic:nvPicPr>
+                  <pic:blipFill>
+                    <a:blip r:embed="rId20"/>
+                    <a:stretch>
+                      <a:fillRect/>
+                    </a:stretch>
+                  </pic:blipFill>
+                  <pic:spPr>
+                    <a:xfrm>
+                      <a:off x="0" y="0"/>
+                      <a:ext cx="5029200" cy="3143250"/>
+                    </a:xfrm>
+                    <a:prstGeom prst="rect"/>
+                  </pic:spPr>
+                </pic:pic>
+              </a:graphicData>
+            </a:graphic>
+          </wp:inline>
+        </w:drawing>
+      </w:r>
+    </w:p>
+    <w:p>
+      <w:pPr>
+        <w:jc w:val="center"/>
+      </w:pPr>
+      <w:r>
+        <w:rPr>
+          <w:i/>
+          <w:sz w:val="18"/>
+        </w:rPr>
+        <w:t>Figure 14: API /health Endpoint — Model Loaded</w:t>
       </w:r>
     </w:p>
     <w:p>
@@ -5927,7 +6029,7 @@
         <w:drawing>
           <wp:inline xmlns:a="http://schemas.openxmlformats.org/drawingml/2006/main" xmlns:pic="http://schemas.openxmlformats.org/drawingml/2006/picture">
             <wp:extent cx="5029200" cy="3143250"/>
-            <wp:docPr id="11" name="Picture 11"/>
+            <wp:docPr id="13" name="Picture 13"/>
             <wp:cNvGraphicFramePr>
               <a:graphicFrameLocks noChangeAspect="1"/>
             </wp:cNvGraphicFramePr>
@@ -5939,7 +6041,7 @@
                     <pic:cNvPicPr/>
                   </pic:nvPicPr>
                   <pic:blipFill>
-                    <a:blip r:embed="rId19"/>
+                    <a:blip r:embed="rId21"/>
                     <a:stretch>
                       <a:fillRect/>
                     </a:stretch>
@@ -5967,7 +6069,7 @@
           <w:i/>
           <w:sz w:val="18"/>
         </w:rPr>
-        <w:t>Figure 13: kubectl get pods — 2 Replicas Running</w:t>
+        <w:t>Figure 15: kubectl get pods — 2 Replicas Running</w:t>
       </w:r>
     </w:p>
     <w:p>
@@ -5978,7 +6080,7 @@
         <w:drawing>
           <wp:inline xmlns:a="http://schemas.openxmlformats.org/drawingml/2006/main" xmlns:pic="http://schemas.openxmlformats.org/drawingml/2006/picture">
             <wp:extent cx="5029200" cy="3143250"/>
-            <wp:docPr id="12" name="Picture 12"/>
+            <wp:docPr id="14" name="Picture 14"/>
             <wp:cNvGraphicFramePr>
               <a:graphicFrameLocks noChangeAspect="1"/>
             </wp:cNvGraphicFramePr>
@@ -5990,7 +6092,7 @@
                     <pic:cNvPicPr/>
                   </pic:nvPicPr>
                   <pic:blipFill>
-                    <a:blip r:embed="rId20"/>
+                    <a:blip r:embed="rId22"/>
                     <a:stretch>
                       <a:fillRect/>
                     </a:stretch>
@@ -6018,7 +6120,58 @@
           <w:i/>
           <w:sz w:val="18"/>
         </w:rPr>
-        <w:t>Figure 14: kubectl get services — LoadBalancer Exposed</w:t>
+        <w:t>Figure 16: kubectl get services — LoadBalancer Exposed</w:t>
+      </w:r>
+    </w:p>
+    <w:p>
+      <w:pPr>
+        <w:jc w:val="center"/>
+      </w:pPr>
+      <w:r>
+        <w:drawing>
+          <wp:inline xmlns:a="http://schemas.openxmlformats.org/drawingml/2006/main" xmlns:pic="http://schemas.openxmlformats.org/drawingml/2006/picture">
+            <wp:extent cx="5029200" cy="3143250"/>
+            <wp:docPr id="15" name="Picture 15"/>
+            <wp:cNvGraphicFramePr>
+              <a:graphicFrameLocks noChangeAspect="1"/>
+            </wp:cNvGraphicFramePr>
+            <a:graphic>
+              <a:graphicData uri="http://schemas.openxmlformats.org/drawingml/2006/picture">
+                <pic:pic>
+                  <pic:nvPicPr>
+                    <pic:cNvPr id="0" name="k8s_all_resources.png"/>
+                    <pic:cNvPicPr/>
+                  </pic:nvPicPr>
+                  <pic:blipFill>
+                    <a:blip r:embed="rId23"/>
+                    <a:stretch>
+                      <a:fillRect/>
+                    </a:stretch>
+                  </pic:blipFill>
+                  <pic:spPr>
+                    <a:xfrm>
+                      <a:off x="0" y="0"/>
+                      <a:ext cx="5029200" cy="3143250"/>
+                    </a:xfrm>
+                    <a:prstGeom prst="rect"/>
+                  </pic:spPr>
+                </pic:pic>
+              </a:graphicData>
+            </a:graphic>
+          </wp:inline>
+        </w:drawing>
+      </w:r>
+    </w:p>
+    <w:p>
+      <w:pPr>
+        <w:jc w:val="center"/>
+      </w:pPr>
+      <w:r>
+        <w:rPr>
+          <w:i/>
+          <w:sz w:val="18"/>
+        </w:rPr>
+        <w:t>Figure 17: kubectl get all — Full Deployment State</w:t>
       </w:r>
     </w:p>
     <w:p>
@@ -6609,7 +6762,7 @@
         <w:drawing>
           <wp:inline xmlns:a="http://schemas.openxmlformats.org/drawingml/2006/main" xmlns:pic="http://schemas.openxmlformats.org/drawingml/2006/picture">
             <wp:extent cx="5029200" cy="3143250"/>
-            <wp:docPr id="13" name="Picture 13"/>
+            <wp:docPr id="16" name="Picture 16"/>
             <wp:cNvGraphicFramePr>
               <a:graphicFrameLocks noChangeAspect="1"/>
             </wp:cNvGraphicFramePr>
@@ -6617,11 +6770,11 @@
               <a:graphicData uri="http://schemas.openxmlformats.org/drawingml/2006/picture">
                 <pic:pic>
                   <pic:nvPicPr>
-                    <pic:cNvPr id="0" name="prometheus_metrics.png"/>
+                    <pic:cNvPr id="0" name="prometheus_targets.png"/>
                     <pic:cNvPicPr/>
                   </pic:nvPicPr>
                   <pic:blipFill>
-                    <a:blip r:embed="rId21"/>
+                    <a:blip r:embed="rId24"/>
                     <a:stretch>
                       <a:fillRect/>
                     </a:stretch>
@@ -6649,7 +6802,7 @@
           <w:i/>
           <w:sz w:val="18"/>
         </w:rPr>
-        <w:t>Figure 15: Prometheus — api_requests_total Metric</w:t>
+        <w:t>Figure 18: Prometheus — Scrape Targets (API Endpoint UP)</w:t>
       </w:r>
     </w:p>
     <w:p>
@@ -6660,7 +6813,7 @@
         <w:drawing>
           <wp:inline xmlns:a="http://schemas.openxmlformats.org/drawingml/2006/main" xmlns:pic="http://schemas.openxmlformats.org/drawingml/2006/picture">
             <wp:extent cx="5029200" cy="3143250"/>
-            <wp:docPr id="14" name="Picture 14"/>
+            <wp:docPr id="17" name="Picture 17"/>
             <wp:cNvGraphicFramePr>
               <a:graphicFrameLocks noChangeAspect="1"/>
             </wp:cNvGraphicFramePr>
@@ -6668,11 +6821,11 @@
               <a:graphicData uri="http://schemas.openxmlformats.org/drawingml/2006/picture">
                 <pic:pic>
                   <pic:nvPicPr>
-                    <pic:cNvPr id="0" name="grafana_dashboard.png"/>
+                    <pic:cNvPr id="0" name="prometheus_metrics.png"/>
                     <pic:cNvPicPr/>
                   </pic:nvPicPr>
                   <pic:blipFill>
-                    <a:blip r:embed="rId22"/>
+                    <a:blip r:embed="rId25"/>
                     <a:stretch>
                       <a:fillRect/>
                     </a:stretch>
@@ -6700,7 +6853,109 @@
           <w:i/>
           <w:sz w:val="18"/>
         </w:rPr>
-        <w:t>Figure 16: Grafana Dashboard — API Request Rate and Latency</w:t>
+        <w:t>Figure 19: Prometheus — api_requests_total Metric</w:t>
+      </w:r>
+    </w:p>
+    <w:p>
+      <w:pPr>
+        <w:jc w:val="center"/>
+      </w:pPr>
+      <w:r>
+        <w:drawing>
+          <wp:inline xmlns:a="http://schemas.openxmlformats.org/drawingml/2006/main" xmlns:pic="http://schemas.openxmlformats.org/drawingml/2006/picture">
+            <wp:extent cx="5029200" cy="3143250"/>
+            <wp:docPr id="18" name="Picture 18"/>
+            <wp:cNvGraphicFramePr>
+              <a:graphicFrameLocks noChangeAspect="1"/>
+            </wp:cNvGraphicFramePr>
+            <a:graphic>
+              <a:graphicData uri="http://schemas.openxmlformats.org/drawingml/2006/picture">
+                <pic:pic>
+                  <pic:nvPicPr>
+                    <pic:cNvPr id="0" name="api_metrics_raw.png"/>
+                    <pic:cNvPicPr/>
+                  </pic:nvPicPr>
+                  <pic:blipFill>
+                    <a:blip r:embed="rId26"/>
+                    <a:stretch>
+                      <a:fillRect/>
+                    </a:stretch>
+                  </pic:blipFill>
+                  <pic:spPr>
+                    <a:xfrm>
+                      <a:off x="0" y="0"/>
+                      <a:ext cx="5029200" cy="3143250"/>
+                    </a:xfrm>
+                    <a:prstGeom prst="rect"/>
+                  </pic:spPr>
+                </pic:pic>
+              </a:graphicData>
+            </a:graphic>
+          </wp:inline>
+        </w:drawing>
+      </w:r>
+    </w:p>
+    <w:p>
+      <w:pPr>
+        <w:jc w:val="center"/>
+      </w:pPr>
+      <w:r>
+        <w:rPr>
+          <w:i/>
+          <w:sz w:val="18"/>
+        </w:rPr>
+        <w:t>Figure 20: Raw /metrics Endpoint — Prometheus Text Format</w:t>
+      </w:r>
+    </w:p>
+    <w:p>
+      <w:pPr>
+        <w:jc w:val="center"/>
+      </w:pPr>
+      <w:r>
+        <w:drawing>
+          <wp:inline xmlns:a="http://schemas.openxmlformats.org/drawingml/2006/main" xmlns:pic="http://schemas.openxmlformats.org/drawingml/2006/picture">
+            <wp:extent cx="5029200" cy="3143250"/>
+            <wp:docPr id="19" name="Picture 19"/>
+            <wp:cNvGraphicFramePr>
+              <a:graphicFrameLocks noChangeAspect="1"/>
+            </wp:cNvGraphicFramePr>
+            <a:graphic>
+              <a:graphicData uri="http://schemas.openxmlformats.org/drawingml/2006/picture">
+                <pic:pic>
+                  <pic:nvPicPr>
+                    <pic:cNvPr id="0" name="grafana_dashboard.png"/>
+                    <pic:cNvPicPr/>
+                  </pic:nvPicPr>
+                  <pic:blipFill>
+                    <a:blip r:embed="rId27"/>
+                    <a:stretch>
+                      <a:fillRect/>
+                    </a:stretch>
+                  </pic:blipFill>
+                  <pic:spPr>
+                    <a:xfrm>
+                      <a:off x="0" y="0"/>
+                      <a:ext cx="5029200" cy="3143250"/>
+                    </a:xfrm>
+                    <a:prstGeom prst="rect"/>
+                  </pic:spPr>
+                </pic:pic>
+              </a:graphicData>
+            </a:graphic>
+          </wp:inline>
+        </w:drawing>
+      </w:r>
+    </w:p>
+    <w:p>
+      <w:pPr>
+        <w:jc w:val="center"/>
+      </w:pPr>
+      <w:r>
+        <w:rPr>
+          <w:i/>
+          <w:sz w:val="18"/>
+        </w:rPr>
+        <w:t>Figure 21: Grafana Dashboard — API Request Rate and Latency</w:t>
       </w:r>
     </w:p>
     <w:p>
@@ -7168,20 +7423,7 @@
           <w:i w:val="0"/>
           <w:sz w:val="22"/>
         </w:rPr>
-        <w:t>GitHub Repository: https://github.com/&lt;your-username&gt;/heart-disease-mlops</w:t>
-      </w:r>
-    </w:p>
-    <w:p>
-      <w:pPr>
-        <w:spacing w:after="120"/>
-      </w:pPr>
-      <w:r>
-        <w:rPr>
-          <w:b w:val="0"/>
-          <w:i/>
-          <w:sz w:val="22"/>
-        </w:rPr>
-        <w:t>Replace &lt;your-username&gt; with your actual GitHub username after pushing.</w:t>
+        <w:t>GitHub Repository: https://github.com/yogisamy/MLOps-Assignment1</w:t>
       </w:r>
     </w:p>
     <w:sectPr>

</xml_diff>